<commit_message>
added schedule to documentation
</commit_message>
<xml_diff>
--- a/documentation.docx
+++ b/documentation.docx
@@ -8218,6 +8218,9 @@
         <w:shd w:val="clear" w:color="auto" w:fill="F0F0F0"/>
         <w:spacing w:before="60" w:after="60"/>
         <w:ind w:left="360"/>
+        <w:rPr>
+          <w:lang w:val="en-US"/>
+        </w:rPr>
       </w:pPr>
       <w:proofErr w:type="spellStart"/>
       <w:r>
@@ -8226,6 +8229,7 @@
           <w:color w:val="1E1E1E"/>
           <w:sz w:val="18"/>
           <w:szCs w:val="18"/>
+          <w:lang w:val="en-US"/>
         </w:rPr>
         <w:t>mvn</w:t>
       </w:r>
@@ -8236,8 +8240,9 @@
           <w:color w:val="1E1E1E"/>
           <w:sz w:val="18"/>
           <w:szCs w:val="18"/>
-        </w:rPr>
-        <w:t xml:space="preserve"> </w:t>
+          <w:lang w:val="en-US"/>
+        </w:rPr>
+        <w:t xml:space="preserve"> compile </w:t>
       </w:r>
       <w:proofErr w:type="spellStart"/>
       <w:r>
@@ -8246,8 +8251,9 @@
           <w:color w:val="1E1E1E"/>
           <w:sz w:val="18"/>
           <w:szCs w:val="18"/>
-        </w:rPr>
-        <w:t>compile</w:t>
+          <w:lang w:val="en-US"/>
+        </w:rPr>
+        <w:t>exec:java</w:t>
       </w:r>
       <w:proofErr w:type="spellEnd"/>
       <w:r>
@@ -8256,8 +8262,9 @@
           <w:color w:val="1E1E1E"/>
           <w:sz w:val="18"/>
           <w:szCs w:val="18"/>
-        </w:rPr>
-        <w:t xml:space="preserve"> </w:t>
+          <w:lang w:val="en-US"/>
+        </w:rPr>
+        <w:t xml:space="preserve"> -</w:t>
       </w:r>
       <w:proofErr w:type="spellStart"/>
       <w:r>
@@ -8266,8 +8273,9 @@
           <w:color w:val="1E1E1E"/>
           <w:sz w:val="18"/>
           <w:szCs w:val="18"/>
-        </w:rPr>
-        <w:t>exec:java</w:t>
+          <w:lang w:val="en-US"/>
+        </w:rPr>
+        <w:t>Dexec.mainClass</w:t>
       </w:r>
       <w:proofErr w:type="spellEnd"/>
       <w:r>
@@ -8276,8 +8284,9 @@
           <w:color w:val="1E1E1E"/>
           <w:sz w:val="18"/>
           <w:szCs w:val="18"/>
-        </w:rPr>
-        <w:t xml:space="preserve"> -</w:t>
+          <w:lang w:val="en-US"/>
+        </w:rPr>
+        <w:t>="</w:t>
       </w:r>
       <w:proofErr w:type="spellStart"/>
       <w:r>
@@ -8286,8 +8295,9 @@
           <w:color w:val="1E1E1E"/>
           <w:sz w:val="18"/>
           <w:szCs w:val="18"/>
-        </w:rPr>
-        <w:t>Dexec.mainClass</w:t>
+          <w:lang w:val="en-US"/>
+        </w:rPr>
+        <w:t>org.main.Main</w:t>
       </w:r>
       <w:proofErr w:type="spellEnd"/>
       <w:r>
@@ -8296,31 +8306,18 @@
           <w:color w:val="1E1E1E"/>
           <w:sz w:val="18"/>
           <w:szCs w:val="18"/>
-        </w:rPr>
-        <w:t>="</w:t>
-      </w:r>
-      <w:proofErr w:type="spellStart"/>
-      <w:r>
-        <w:rPr>
-          <w:rFonts w:ascii="Courier New" w:eastAsia="Courier New" w:hAnsi="Courier New" w:cs="Courier New"/>
-          <w:color w:val="1E1E1E"/>
-          <w:sz w:val="18"/>
-          <w:szCs w:val="18"/>
-        </w:rPr>
-        <w:t>org.main.Main</w:t>
-      </w:r>
-      <w:proofErr w:type="spellEnd"/>
-      <w:r>
-        <w:rPr>
-          <w:rFonts w:ascii="Courier New" w:eastAsia="Courier New" w:hAnsi="Courier New" w:cs="Courier New"/>
-          <w:color w:val="1E1E1E"/>
-          <w:sz w:val="18"/>
-          <w:szCs w:val="18"/>
+          <w:lang w:val="en-US"/>
         </w:rPr>
         <w:t>"</w:t>
       </w:r>
     </w:p>
-    <w:p/>
+    <w:p>
+      <w:pPr>
+        <w:rPr>
+          <w:lang w:val="en-US"/>
+        </w:rPr>
+      </w:pPr>
+    </w:p>
     <w:p>
       <w:r>
         <w:t xml:space="preserve">2. Aplikacja wypisze na konsolę dane bloków, transakcji i statystyki, a następnie uruchomi </w:t>
@@ -9748,6 +9745,1412 @@
         <w:t xml:space="preserve"> Punkt startowy: blok #10881089</w:t>
       </w:r>
     </w:p>
+    <w:p/>
+    <w:p>
+      <w:pPr>
+        <w:rPr>
+          <w:b/>
+          <w:bCs/>
+          <w:color w:val="1A3A6B"/>
+          <w:sz w:val="40"/>
+          <w:szCs w:val="40"/>
+        </w:rPr>
+      </w:pPr>
+      <w:r>
+        <w:br w:type="page"/>
+      </w:r>
+    </w:p>
+    <w:p>
+      <w:pPr>
+        <w:pStyle w:val="Nagwek1"/>
+      </w:pPr>
+      <w:r>
+        <w:lastRenderedPageBreak/>
+        <w:t>6</w:t>
+      </w:r>
+      <w:r>
+        <w:t xml:space="preserve">. </w:t>
+      </w:r>
+      <w:r>
+        <w:t>Harmonogram i podział zadań</w:t>
+      </w:r>
+    </w:p>
+    <w:tbl>
+      <w:tblPr>
+        <w:tblW w:w="0" w:type="auto"/>
+        <w:tblCellMar>
+          <w:top w:w="15" w:type="dxa"/>
+          <w:left w:w="15" w:type="dxa"/>
+          <w:bottom w:w="15" w:type="dxa"/>
+          <w:right w:w="15" w:type="dxa"/>
+        </w:tblCellMar>
+        <w:tblLook w:val="04A0" w:firstRow="1" w:lastRow="0" w:firstColumn="1" w:lastColumn="0" w:noHBand="0" w:noVBand="1"/>
+      </w:tblPr>
+      <w:tblGrid>
+        <w:gridCol w:w="1252"/>
+        <w:gridCol w:w="860"/>
+        <w:gridCol w:w="860"/>
+        <w:gridCol w:w="2835"/>
+        <w:gridCol w:w="1559"/>
+        <w:gridCol w:w="1650"/>
+      </w:tblGrid>
+      <w:tr>
+        <w:trPr>
+          <w:trHeight w:val="546"/>
+        </w:trPr>
+        <w:tc>
+          <w:tcPr>
+            <w:tcW w:w="0" w:type="auto"/>
+            <w:gridSpan w:val="6"/>
+            <w:tcBorders>
+              <w:top w:val="single" w:sz="4" w:space="0" w:color="000000"/>
+              <w:left w:val="single" w:sz="4" w:space="0" w:color="000000"/>
+              <w:bottom w:val="single" w:sz="4" w:space="0" w:color="000000"/>
+              <w:right w:val="single" w:sz="4" w:space="0" w:color="000000"/>
+            </w:tcBorders>
+            <w:tcMar>
+              <w:top w:w="0" w:type="dxa"/>
+              <w:left w:w="70" w:type="dxa"/>
+              <w:bottom w:w="0" w:type="dxa"/>
+              <w:right w:w="70" w:type="dxa"/>
+            </w:tcMar>
+            <w:vAlign w:val="center"/>
+            <w:hideMark/>
+          </w:tcPr>
+          <w:p>
+            <w:pPr>
+              <w:rPr>
+                <w:b/>
+                <w:bCs/>
+              </w:rPr>
+            </w:pPr>
+            <w:r>
+              <w:rPr>
+                <w:b/>
+                <w:bCs/>
+              </w:rPr>
+              <w:t xml:space="preserve">Nazwa zespołu:  </w:t>
+            </w:r>
+            <w:proofErr w:type="spellStart"/>
+            <w:r>
+              <w:rPr>
+                <w:b/>
+                <w:bCs/>
+              </w:rPr>
+              <w:t>Caudata</w:t>
+            </w:r>
+            <w:proofErr w:type="spellEnd"/>
+          </w:p>
+          <w:p>
+            <w:pPr>
+              <w:rPr>
+                <w:b/>
+                <w:bCs/>
+              </w:rPr>
+            </w:pPr>
+            <w:r>
+              <w:rPr>
+                <w:b/>
+                <w:bCs/>
+              </w:rPr>
+              <w:t xml:space="preserve">Temat projektu: Monitor Danych </w:t>
+            </w:r>
+            <w:proofErr w:type="spellStart"/>
+            <w:r>
+              <w:rPr>
+                <w:b/>
+                <w:bCs/>
+              </w:rPr>
+              <w:t>Blockchain</w:t>
+            </w:r>
+            <w:proofErr w:type="spellEnd"/>
+          </w:p>
+          <w:p>
+            <w:pPr>
+              <w:rPr>
+                <w:b/>
+                <w:bCs/>
+              </w:rPr>
+            </w:pPr>
+            <w:r>
+              <w:rPr>
+                <w:b/>
+                <w:bCs/>
+              </w:rPr>
+              <w:t>Skład osobowy:  </w:t>
+            </w:r>
+          </w:p>
+        </w:tc>
+      </w:tr>
+      <w:tr>
+        <w:trPr>
+          <w:trHeight w:val="855"/>
+        </w:trPr>
+        <w:tc>
+          <w:tcPr>
+            <w:tcW w:w="0" w:type="auto"/>
+            <w:gridSpan w:val="2"/>
+            <w:tcBorders>
+              <w:top w:val="single" w:sz="4" w:space="0" w:color="000000"/>
+              <w:left w:val="single" w:sz="4" w:space="0" w:color="000000"/>
+              <w:bottom w:val="single" w:sz="4" w:space="0" w:color="000000"/>
+              <w:right w:val="single" w:sz="4" w:space="0" w:color="000000"/>
+            </w:tcBorders>
+            <w:tcMar>
+              <w:top w:w="0" w:type="dxa"/>
+              <w:left w:w="70" w:type="dxa"/>
+              <w:bottom w:w="0" w:type="dxa"/>
+              <w:right w:w="70" w:type="dxa"/>
+            </w:tcMar>
+            <w:vAlign w:val="center"/>
+            <w:hideMark/>
+          </w:tcPr>
+          <w:p>
+            <w:pPr>
+              <w:rPr>
+                <w:b/>
+                <w:bCs/>
+              </w:rPr>
+            </w:pPr>
+          </w:p>
+        </w:tc>
+        <w:tc>
+          <w:tcPr>
+            <w:tcW w:w="0" w:type="auto"/>
+            <w:gridSpan w:val="4"/>
+            <w:tcBorders>
+              <w:top w:val="single" w:sz="4" w:space="0" w:color="000000"/>
+              <w:bottom w:val="single" w:sz="4" w:space="0" w:color="000000"/>
+              <w:right w:val="single" w:sz="4" w:space="0" w:color="000000"/>
+            </w:tcBorders>
+            <w:tcMar>
+              <w:top w:w="0" w:type="dxa"/>
+              <w:left w:w="70" w:type="dxa"/>
+              <w:bottom w:w="0" w:type="dxa"/>
+              <w:right w:w="70" w:type="dxa"/>
+            </w:tcMar>
+            <w:vAlign w:val="center"/>
+            <w:hideMark/>
+          </w:tcPr>
+          <w:p>
+            <w:pPr>
+              <w:rPr>
+                <w:b/>
+                <w:bCs/>
+              </w:rPr>
+            </w:pPr>
+            <w:r>
+              <w:rPr>
+                <w:b/>
+                <w:bCs/>
+              </w:rPr>
+              <w:t>1. Michał Samosiuk</w:t>
+            </w:r>
+          </w:p>
+          <w:p>
+            <w:pPr>
+              <w:rPr>
+                <w:b/>
+                <w:bCs/>
+              </w:rPr>
+            </w:pPr>
+            <w:r>
+              <w:rPr>
+                <w:b/>
+                <w:bCs/>
+              </w:rPr>
+              <w:t>2. Maciej Poźniak</w:t>
+            </w:r>
+          </w:p>
+          <w:p>
+            <w:pPr>
+              <w:rPr>
+                <w:b/>
+                <w:bCs/>
+              </w:rPr>
+            </w:pPr>
+            <w:r>
+              <w:rPr>
+                <w:b/>
+                <w:bCs/>
+              </w:rPr>
+              <w:t>3. Fabian Sobolewski</w:t>
+            </w:r>
+          </w:p>
+          <w:p>
+            <w:pPr>
+              <w:rPr>
+                <w:b/>
+                <w:bCs/>
+              </w:rPr>
+            </w:pPr>
+            <w:r>
+              <w:rPr>
+                <w:b/>
+                <w:bCs/>
+              </w:rPr>
+              <w:t>4. Natalia Nawrocka</w:t>
+            </w:r>
+          </w:p>
+          <w:p>
+            <w:pPr>
+              <w:rPr>
+                <w:b/>
+                <w:bCs/>
+              </w:rPr>
+            </w:pPr>
+            <w:r>
+              <w:rPr>
+                <w:b/>
+                <w:bCs/>
+              </w:rPr>
+              <w:t> </w:t>
+            </w:r>
+          </w:p>
+          <w:p>
+            <w:pPr>
+              <w:rPr>
+                <w:b/>
+                <w:bCs/>
+              </w:rPr>
+            </w:pPr>
+            <w:r>
+              <w:rPr>
+                <w:b/>
+                <w:bCs/>
+              </w:rPr>
+              <w:t> </w:t>
+            </w:r>
+          </w:p>
+          <w:p>
+            <w:pPr>
+              <w:rPr>
+                <w:b/>
+                <w:bCs/>
+              </w:rPr>
+            </w:pPr>
+          </w:p>
+        </w:tc>
+      </w:tr>
+      <w:tr>
+        <w:trPr>
+          <w:trHeight w:val="1260"/>
+        </w:trPr>
+        <w:tc>
+          <w:tcPr>
+            <w:tcW w:w="0" w:type="auto"/>
+            <w:tcBorders>
+              <w:top w:val="single" w:sz="4" w:space="0" w:color="000000"/>
+              <w:left w:val="single" w:sz="4" w:space="0" w:color="000000"/>
+              <w:bottom w:val="single" w:sz="4" w:space="0" w:color="000000"/>
+              <w:right w:val="single" w:sz="4" w:space="0" w:color="000000"/>
+            </w:tcBorders>
+            <w:tcMar>
+              <w:top w:w="0" w:type="dxa"/>
+              <w:left w:w="70" w:type="dxa"/>
+              <w:bottom w:w="0" w:type="dxa"/>
+              <w:right w:w="70" w:type="dxa"/>
+            </w:tcMar>
+            <w:vAlign w:val="center"/>
+            <w:hideMark/>
+          </w:tcPr>
+          <w:p>
+            <w:pPr>
+              <w:rPr>
+                <w:b/>
+                <w:bCs/>
+              </w:rPr>
+            </w:pPr>
+            <w:r>
+              <w:rPr>
+                <w:b/>
+                <w:bCs/>
+              </w:rPr>
+              <w:t>Nr zadania</w:t>
+            </w:r>
+          </w:p>
+        </w:tc>
+        <w:tc>
+          <w:tcPr>
+            <w:tcW w:w="1730" w:type="dxa"/>
+            <w:gridSpan w:val="2"/>
+            <w:tcBorders>
+              <w:top w:val="single" w:sz="4" w:space="0" w:color="000000"/>
+              <w:left w:val="single" w:sz="4" w:space="0" w:color="000000"/>
+              <w:bottom w:val="single" w:sz="4" w:space="0" w:color="000000"/>
+              <w:right w:val="single" w:sz="4" w:space="0" w:color="000000"/>
+            </w:tcBorders>
+            <w:tcMar>
+              <w:top w:w="0" w:type="dxa"/>
+              <w:left w:w="70" w:type="dxa"/>
+              <w:bottom w:w="0" w:type="dxa"/>
+              <w:right w:w="70" w:type="dxa"/>
+            </w:tcMar>
+            <w:vAlign w:val="center"/>
+            <w:hideMark/>
+          </w:tcPr>
+          <w:p>
+            <w:pPr>
+              <w:rPr>
+                <w:b/>
+                <w:bCs/>
+              </w:rPr>
+            </w:pPr>
+            <w:r>
+              <w:rPr>
+                <w:b/>
+                <w:bCs/>
+              </w:rPr>
+              <w:t>Opis zadania</w:t>
+            </w:r>
+          </w:p>
+        </w:tc>
+        <w:tc>
+          <w:tcPr>
+            <w:tcW w:w="2835" w:type="dxa"/>
+            <w:tcBorders>
+              <w:top w:val="single" w:sz="4" w:space="0" w:color="000000"/>
+              <w:left w:val="single" w:sz="4" w:space="0" w:color="000000"/>
+              <w:bottom w:val="single" w:sz="4" w:space="0" w:color="000000"/>
+              <w:right w:val="single" w:sz="4" w:space="0" w:color="000000"/>
+            </w:tcBorders>
+            <w:tcMar>
+              <w:top w:w="0" w:type="dxa"/>
+              <w:left w:w="70" w:type="dxa"/>
+              <w:bottom w:w="0" w:type="dxa"/>
+              <w:right w:w="70" w:type="dxa"/>
+            </w:tcMar>
+            <w:vAlign w:val="center"/>
+            <w:hideMark/>
+          </w:tcPr>
+          <w:p>
+            <w:pPr>
+              <w:rPr>
+                <w:b/>
+                <w:bCs/>
+              </w:rPr>
+            </w:pPr>
+            <w:r>
+              <w:rPr>
+                <w:b/>
+                <w:bCs/>
+              </w:rPr>
+              <w:t>Osoba (osoby) </w:t>
+            </w:r>
+          </w:p>
+          <w:p>
+            <w:pPr>
+              <w:rPr>
+                <w:b/>
+                <w:bCs/>
+              </w:rPr>
+            </w:pPr>
+            <w:r>
+              <w:rPr>
+                <w:b/>
+                <w:bCs/>
+              </w:rPr>
+              <w:t>przypisane do zadania – imię i nazwisko</w:t>
+            </w:r>
+          </w:p>
+        </w:tc>
+        <w:tc>
+          <w:tcPr>
+            <w:tcW w:w="1559" w:type="dxa"/>
+            <w:tcBorders>
+              <w:top w:val="single" w:sz="4" w:space="0" w:color="000000"/>
+              <w:left w:val="single" w:sz="4" w:space="0" w:color="000000"/>
+              <w:bottom w:val="single" w:sz="4" w:space="0" w:color="000000"/>
+              <w:right w:val="single" w:sz="4" w:space="0" w:color="000000"/>
+            </w:tcBorders>
+            <w:tcMar>
+              <w:top w:w="0" w:type="dxa"/>
+              <w:left w:w="70" w:type="dxa"/>
+              <w:bottom w:w="0" w:type="dxa"/>
+              <w:right w:w="70" w:type="dxa"/>
+            </w:tcMar>
+            <w:vAlign w:val="center"/>
+            <w:hideMark/>
+          </w:tcPr>
+          <w:p>
+            <w:pPr>
+              <w:rPr>
+                <w:b/>
+                <w:bCs/>
+              </w:rPr>
+            </w:pPr>
+            <w:r>
+              <w:rPr>
+                <w:b/>
+                <w:bCs/>
+              </w:rPr>
+              <w:t>Data rozpoczęcia zadania</w:t>
+            </w:r>
+          </w:p>
+        </w:tc>
+        <w:tc>
+          <w:tcPr>
+            <w:tcW w:w="1650" w:type="dxa"/>
+            <w:tcBorders>
+              <w:top w:val="single" w:sz="4" w:space="0" w:color="000000"/>
+              <w:left w:val="single" w:sz="4" w:space="0" w:color="000000"/>
+              <w:bottom w:val="single" w:sz="4" w:space="0" w:color="000000"/>
+              <w:right w:val="single" w:sz="4" w:space="0" w:color="000000"/>
+            </w:tcBorders>
+            <w:tcMar>
+              <w:top w:w="0" w:type="dxa"/>
+              <w:left w:w="70" w:type="dxa"/>
+              <w:bottom w:w="0" w:type="dxa"/>
+              <w:right w:w="70" w:type="dxa"/>
+            </w:tcMar>
+            <w:vAlign w:val="center"/>
+            <w:hideMark/>
+          </w:tcPr>
+          <w:p>
+            <w:pPr>
+              <w:rPr>
+                <w:b/>
+                <w:bCs/>
+              </w:rPr>
+            </w:pPr>
+            <w:r>
+              <w:rPr>
+                <w:b/>
+                <w:bCs/>
+              </w:rPr>
+              <w:t>Data zakończenia zadania</w:t>
+            </w:r>
+          </w:p>
+        </w:tc>
+      </w:tr>
+      <w:tr>
+        <w:trPr>
+          <w:trHeight w:val="315"/>
+        </w:trPr>
+        <w:tc>
+          <w:tcPr>
+            <w:tcW w:w="0" w:type="auto"/>
+            <w:tcBorders>
+              <w:top w:val="single" w:sz="4" w:space="0" w:color="000000"/>
+              <w:left w:val="single" w:sz="4" w:space="0" w:color="000000"/>
+              <w:bottom w:val="single" w:sz="4" w:space="0" w:color="000000"/>
+              <w:right w:val="single" w:sz="4" w:space="0" w:color="000000"/>
+            </w:tcBorders>
+            <w:tcMar>
+              <w:top w:w="0" w:type="dxa"/>
+              <w:left w:w="70" w:type="dxa"/>
+              <w:bottom w:w="0" w:type="dxa"/>
+              <w:right w:w="70" w:type="dxa"/>
+            </w:tcMar>
+            <w:vAlign w:val="center"/>
+            <w:hideMark/>
+          </w:tcPr>
+          <w:p>
+            <w:pPr>
+              <w:jc w:val="center"/>
+            </w:pPr>
+            <w:r>
+              <w:t>1</w:t>
+            </w:r>
+          </w:p>
+        </w:tc>
+        <w:tc>
+          <w:tcPr>
+            <w:tcW w:w="1730" w:type="dxa"/>
+            <w:gridSpan w:val="2"/>
+            <w:tcBorders>
+              <w:top w:val="single" w:sz="4" w:space="0" w:color="000000"/>
+              <w:left w:val="single" w:sz="4" w:space="0" w:color="000000"/>
+              <w:bottom w:val="single" w:sz="4" w:space="0" w:color="000000"/>
+              <w:right w:val="single" w:sz="4" w:space="0" w:color="000000"/>
+            </w:tcBorders>
+            <w:tcMar>
+              <w:top w:w="0" w:type="dxa"/>
+              <w:left w:w="70" w:type="dxa"/>
+              <w:bottom w:w="0" w:type="dxa"/>
+              <w:right w:w="70" w:type="dxa"/>
+            </w:tcMar>
+            <w:vAlign w:val="center"/>
+            <w:hideMark/>
+          </w:tcPr>
+          <w:p>
+            <w:r>
+              <w:t>Dobranie technologii i przygotowanie środowiska</w:t>
+            </w:r>
+          </w:p>
+        </w:tc>
+        <w:tc>
+          <w:tcPr>
+            <w:tcW w:w="2835" w:type="dxa"/>
+            <w:tcBorders>
+              <w:top w:val="single" w:sz="4" w:space="0" w:color="000000"/>
+              <w:left w:val="single" w:sz="4" w:space="0" w:color="000000"/>
+              <w:bottom w:val="single" w:sz="4" w:space="0" w:color="000000"/>
+              <w:right w:val="single" w:sz="4" w:space="0" w:color="000000"/>
+            </w:tcBorders>
+            <w:tcMar>
+              <w:top w:w="0" w:type="dxa"/>
+              <w:left w:w="70" w:type="dxa"/>
+              <w:bottom w:w="0" w:type="dxa"/>
+              <w:right w:w="70" w:type="dxa"/>
+            </w:tcMar>
+            <w:vAlign w:val="center"/>
+            <w:hideMark/>
+          </w:tcPr>
+          <w:p>
+            <w:r>
+              <w:t>Michał Samosiuk, Maciej Poźniak</w:t>
+            </w:r>
+          </w:p>
+        </w:tc>
+        <w:tc>
+          <w:tcPr>
+            <w:tcW w:w="1559" w:type="dxa"/>
+            <w:tcBorders>
+              <w:top w:val="single" w:sz="4" w:space="0" w:color="000000"/>
+              <w:left w:val="single" w:sz="4" w:space="0" w:color="000000"/>
+              <w:bottom w:val="single" w:sz="4" w:space="0" w:color="000000"/>
+              <w:right w:val="single" w:sz="4" w:space="0" w:color="000000"/>
+            </w:tcBorders>
+            <w:tcMar>
+              <w:top w:w="0" w:type="dxa"/>
+              <w:left w:w="70" w:type="dxa"/>
+              <w:bottom w:w="0" w:type="dxa"/>
+              <w:right w:w="70" w:type="dxa"/>
+            </w:tcMar>
+            <w:vAlign w:val="center"/>
+            <w:hideMark/>
+          </w:tcPr>
+          <w:p>
+            <w:r>
+              <w:t>25.03.2026</w:t>
+            </w:r>
+          </w:p>
+        </w:tc>
+        <w:tc>
+          <w:tcPr>
+            <w:tcW w:w="1650" w:type="dxa"/>
+            <w:tcBorders>
+              <w:top w:val="single" w:sz="4" w:space="0" w:color="000000"/>
+              <w:left w:val="single" w:sz="4" w:space="0" w:color="000000"/>
+              <w:bottom w:val="single" w:sz="4" w:space="0" w:color="000000"/>
+              <w:right w:val="single" w:sz="4" w:space="0" w:color="000000"/>
+            </w:tcBorders>
+            <w:tcMar>
+              <w:top w:w="0" w:type="dxa"/>
+              <w:left w:w="70" w:type="dxa"/>
+              <w:bottom w:w="0" w:type="dxa"/>
+              <w:right w:w="70" w:type="dxa"/>
+            </w:tcMar>
+            <w:vAlign w:val="center"/>
+            <w:hideMark/>
+          </w:tcPr>
+          <w:p>
+            <w:r>
+              <w:t>1.04.2026</w:t>
+            </w:r>
+          </w:p>
+        </w:tc>
+      </w:tr>
+      <w:tr>
+        <w:trPr>
+          <w:trHeight w:val="315"/>
+        </w:trPr>
+        <w:tc>
+          <w:tcPr>
+            <w:tcW w:w="0" w:type="auto"/>
+            <w:tcBorders>
+              <w:top w:val="single" w:sz="4" w:space="0" w:color="000000"/>
+              <w:left w:val="single" w:sz="4" w:space="0" w:color="000000"/>
+              <w:bottom w:val="single" w:sz="4" w:space="0" w:color="000000"/>
+              <w:right w:val="single" w:sz="4" w:space="0" w:color="000000"/>
+            </w:tcBorders>
+            <w:tcMar>
+              <w:top w:w="0" w:type="dxa"/>
+              <w:left w:w="70" w:type="dxa"/>
+              <w:bottom w:w="0" w:type="dxa"/>
+              <w:right w:w="70" w:type="dxa"/>
+            </w:tcMar>
+            <w:vAlign w:val="center"/>
+            <w:hideMark/>
+          </w:tcPr>
+          <w:p>
+            <w:pPr>
+              <w:jc w:val="center"/>
+            </w:pPr>
+            <w:r>
+              <w:t>2</w:t>
+            </w:r>
+          </w:p>
+        </w:tc>
+        <w:tc>
+          <w:tcPr>
+            <w:tcW w:w="1730" w:type="dxa"/>
+            <w:gridSpan w:val="2"/>
+            <w:tcBorders>
+              <w:top w:val="single" w:sz="4" w:space="0" w:color="000000"/>
+              <w:left w:val="single" w:sz="4" w:space="0" w:color="000000"/>
+              <w:bottom w:val="single" w:sz="4" w:space="0" w:color="000000"/>
+              <w:right w:val="single" w:sz="4" w:space="0" w:color="000000"/>
+            </w:tcBorders>
+            <w:tcMar>
+              <w:top w:w="0" w:type="dxa"/>
+              <w:left w:w="70" w:type="dxa"/>
+              <w:bottom w:w="0" w:type="dxa"/>
+              <w:right w:w="70" w:type="dxa"/>
+            </w:tcMar>
+            <w:vAlign w:val="center"/>
+            <w:hideMark/>
+          </w:tcPr>
+          <w:p>
+            <w:r>
+              <w:t>Pobieranie i Analiza Danych</w:t>
+            </w:r>
+          </w:p>
+        </w:tc>
+        <w:tc>
+          <w:tcPr>
+            <w:tcW w:w="2835" w:type="dxa"/>
+            <w:tcBorders>
+              <w:top w:val="single" w:sz="4" w:space="0" w:color="000000"/>
+              <w:left w:val="single" w:sz="4" w:space="0" w:color="000000"/>
+              <w:bottom w:val="single" w:sz="4" w:space="0" w:color="000000"/>
+              <w:right w:val="single" w:sz="4" w:space="0" w:color="000000"/>
+            </w:tcBorders>
+            <w:tcMar>
+              <w:top w:w="0" w:type="dxa"/>
+              <w:left w:w="70" w:type="dxa"/>
+              <w:bottom w:w="0" w:type="dxa"/>
+              <w:right w:w="70" w:type="dxa"/>
+            </w:tcMar>
+            <w:vAlign w:val="center"/>
+            <w:hideMark/>
+          </w:tcPr>
+          <w:p>
+            <w:r>
+              <w:t>Maciej Poźniak, Fabian Sobolewski</w:t>
+            </w:r>
+          </w:p>
+        </w:tc>
+        <w:tc>
+          <w:tcPr>
+            <w:tcW w:w="1559" w:type="dxa"/>
+            <w:tcBorders>
+              <w:top w:val="single" w:sz="4" w:space="0" w:color="000000"/>
+              <w:left w:val="single" w:sz="4" w:space="0" w:color="000000"/>
+              <w:bottom w:val="single" w:sz="4" w:space="0" w:color="000000"/>
+              <w:right w:val="single" w:sz="4" w:space="0" w:color="000000"/>
+            </w:tcBorders>
+            <w:tcMar>
+              <w:top w:w="0" w:type="dxa"/>
+              <w:left w:w="70" w:type="dxa"/>
+              <w:bottom w:w="0" w:type="dxa"/>
+              <w:right w:w="70" w:type="dxa"/>
+            </w:tcMar>
+            <w:vAlign w:val="center"/>
+            <w:hideMark/>
+          </w:tcPr>
+          <w:p>
+            <w:r>
+              <w:t>27.03.2026</w:t>
+            </w:r>
+          </w:p>
+        </w:tc>
+        <w:tc>
+          <w:tcPr>
+            <w:tcW w:w="1650" w:type="dxa"/>
+            <w:tcBorders>
+              <w:top w:val="single" w:sz="4" w:space="0" w:color="000000"/>
+              <w:left w:val="single" w:sz="4" w:space="0" w:color="000000"/>
+              <w:bottom w:val="single" w:sz="4" w:space="0" w:color="000000"/>
+              <w:right w:val="single" w:sz="4" w:space="0" w:color="000000"/>
+            </w:tcBorders>
+            <w:tcMar>
+              <w:top w:w="0" w:type="dxa"/>
+              <w:left w:w="70" w:type="dxa"/>
+              <w:bottom w:w="0" w:type="dxa"/>
+              <w:right w:w="70" w:type="dxa"/>
+            </w:tcMar>
+            <w:vAlign w:val="center"/>
+            <w:hideMark/>
+          </w:tcPr>
+          <w:p>
+            <w:r>
+              <w:t>15.04.2026</w:t>
+            </w:r>
+          </w:p>
+        </w:tc>
+      </w:tr>
+      <w:tr>
+        <w:trPr>
+          <w:trHeight w:val="315"/>
+        </w:trPr>
+        <w:tc>
+          <w:tcPr>
+            <w:tcW w:w="0" w:type="auto"/>
+            <w:tcBorders>
+              <w:top w:val="single" w:sz="4" w:space="0" w:color="000000"/>
+              <w:left w:val="single" w:sz="4" w:space="0" w:color="000000"/>
+              <w:bottom w:val="single" w:sz="4" w:space="0" w:color="000000"/>
+              <w:right w:val="single" w:sz="4" w:space="0" w:color="000000"/>
+            </w:tcBorders>
+            <w:tcMar>
+              <w:top w:w="0" w:type="dxa"/>
+              <w:left w:w="70" w:type="dxa"/>
+              <w:bottom w:w="0" w:type="dxa"/>
+              <w:right w:w="70" w:type="dxa"/>
+            </w:tcMar>
+            <w:vAlign w:val="center"/>
+            <w:hideMark/>
+          </w:tcPr>
+          <w:p>
+            <w:pPr>
+              <w:jc w:val="center"/>
+            </w:pPr>
+            <w:r>
+              <w:t>3</w:t>
+            </w:r>
+          </w:p>
+        </w:tc>
+        <w:tc>
+          <w:tcPr>
+            <w:tcW w:w="1730" w:type="dxa"/>
+            <w:gridSpan w:val="2"/>
+            <w:tcBorders>
+              <w:top w:val="single" w:sz="4" w:space="0" w:color="000000"/>
+              <w:left w:val="single" w:sz="4" w:space="0" w:color="000000"/>
+              <w:bottom w:val="single" w:sz="4" w:space="0" w:color="000000"/>
+              <w:right w:val="single" w:sz="4" w:space="0" w:color="000000"/>
+            </w:tcBorders>
+            <w:tcMar>
+              <w:top w:w="0" w:type="dxa"/>
+              <w:left w:w="70" w:type="dxa"/>
+              <w:bottom w:w="0" w:type="dxa"/>
+              <w:right w:w="70" w:type="dxa"/>
+            </w:tcMar>
+            <w:vAlign w:val="center"/>
+            <w:hideMark/>
+          </w:tcPr>
+          <w:p>
+            <w:r>
+              <w:t>Utworzenie Prototypu</w:t>
+            </w:r>
+          </w:p>
+        </w:tc>
+        <w:tc>
+          <w:tcPr>
+            <w:tcW w:w="2835" w:type="dxa"/>
+            <w:tcBorders>
+              <w:top w:val="single" w:sz="4" w:space="0" w:color="000000"/>
+              <w:left w:val="single" w:sz="4" w:space="0" w:color="000000"/>
+              <w:bottom w:val="single" w:sz="4" w:space="0" w:color="000000"/>
+              <w:right w:val="single" w:sz="4" w:space="0" w:color="000000"/>
+            </w:tcBorders>
+            <w:tcMar>
+              <w:top w:w="0" w:type="dxa"/>
+              <w:left w:w="70" w:type="dxa"/>
+              <w:bottom w:w="0" w:type="dxa"/>
+              <w:right w:w="70" w:type="dxa"/>
+            </w:tcMar>
+            <w:vAlign w:val="center"/>
+            <w:hideMark/>
+          </w:tcPr>
+          <w:p>
+            <w:r>
+              <w:t>Michał Samosiuk, Maciej Poźniak, Fabian Sobolewski</w:t>
+            </w:r>
+            <w:r>
+              <w:t xml:space="preserve">, </w:t>
+            </w:r>
+            <w:r>
+              <w:t>Natalia Nawrocka</w:t>
+            </w:r>
+          </w:p>
+        </w:tc>
+        <w:tc>
+          <w:tcPr>
+            <w:tcW w:w="1559" w:type="dxa"/>
+            <w:tcBorders>
+              <w:top w:val="single" w:sz="4" w:space="0" w:color="000000"/>
+              <w:left w:val="single" w:sz="4" w:space="0" w:color="000000"/>
+              <w:bottom w:val="single" w:sz="4" w:space="0" w:color="000000"/>
+              <w:right w:val="single" w:sz="4" w:space="0" w:color="000000"/>
+            </w:tcBorders>
+            <w:tcMar>
+              <w:top w:w="0" w:type="dxa"/>
+              <w:left w:w="70" w:type="dxa"/>
+              <w:bottom w:w="0" w:type="dxa"/>
+              <w:right w:w="70" w:type="dxa"/>
+            </w:tcMar>
+            <w:vAlign w:val="center"/>
+            <w:hideMark/>
+          </w:tcPr>
+          <w:p>
+            <w:r>
+              <w:t>08.04.2026</w:t>
+            </w:r>
+          </w:p>
+        </w:tc>
+        <w:tc>
+          <w:tcPr>
+            <w:tcW w:w="1650" w:type="dxa"/>
+            <w:tcBorders>
+              <w:top w:val="single" w:sz="4" w:space="0" w:color="000000"/>
+              <w:left w:val="single" w:sz="4" w:space="0" w:color="000000"/>
+              <w:bottom w:val="single" w:sz="4" w:space="0" w:color="000000"/>
+              <w:right w:val="single" w:sz="4" w:space="0" w:color="000000"/>
+            </w:tcBorders>
+            <w:tcMar>
+              <w:top w:w="0" w:type="dxa"/>
+              <w:left w:w="70" w:type="dxa"/>
+              <w:bottom w:w="0" w:type="dxa"/>
+              <w:right w:w="70" w:type="dxa"/>
+            </w:tcMar>
+            <w:vAlign w:val="center"/>
+            <w:hideMark/>
+          </w:tcPr>
+          <w:p>
+            <w:r>
+              <w:t>22.04.2026</w:t>
+            </w:r>
+          </w:p>
+        </w:tc>
+      </w:tr>
+      <w:tr>
+        <w:trPr>
+          <w:trHeight w:val="315"/>
+        </w:trPr>
+        <w:tc>
+          <w:tcPr>
+            <w:tcW w:w="0" w:type="auto"/>
+            <w:tcBorders>
+              <w:top w:val="single" w:sz="4" w:space="0" w:color="000000"/>
+              <w:left w:val="single" w:sz="4" w:space="0" w:color="000000"/>
+              <w:bottom w:val="single" w:sz="4" w:space="0" w:color="000000"/>
+              <w:right w:val="single" w:sz="4" w:space="0" w:color="000000"/>
+            </w:tcBorders>
+            <w:tcMar>
+              <w:top w:w="0" w:type="dxa"/>
+              <w:left w:w="70" w:type="dxa"/>
+              <w:bottom w:w="0" w:type="dxa"/>
+              <w:right w:w="70" w:type="dxa"/>
+            </w:tcMar>
+            <w:vAlign w:val="center"/>
+            <w:hideMark/>
+          </w:tcPr>
+          <w:p>
+            <w:pPr>
+              <w:jc w:val="center"/>
+            </w:pPr>
+            <w:r>
+              <w:t>4</w:t>
+            </w:r>
+          </w:p>
+        </w:tc>
+        <w:tc>
+          <w:tcPr>
+            <w:tcW w:w="1730" w:type="dxa"/>
+            <w:gridSpan w:val="2"/>
+            <w:tcBorders>
+              <w:top w:val="single" w:sz="4" w:space="0" w:color="000000"/>
+              <w:left w:val="single" w:sz="4" w:space="0" w:color="000000"/>
+              <w:bottom w:val="single" w:sz="4" w:space="0" w:color="000000"/>
+              <w:right w:val="single" w:sz="4" w:space="0" w:color="000000"/>
+            </w:tcBorders>
+            <w:tcMar>
+              <w:top w:w="0" w:type="dxa"/>
+              <w:left w:w="70" w:type="dxa"/>
+              <w:bottom w:w="0" w:type="dxa"/>
+              <w:right w:w="70" w:type="dxa"/>
+            </w:tcMar>
+            <w:vAlign w:val="center"/>
+            <w:hideMark/>
+          </w:tcPr>
+          <w:p>
+            <w:r>
+              <w:t>Implementacja dodatkowych funkcjonalności</w:t>
+            </w:r>
+          </w:p>
+        </w:tc>
+        <w:tc>
+          <w:tcPr>
+            <w:tcW w:w="2835" w:type="dxa"/>
+            <w:tcBorders>
+              <w:top w:val="single" w:sz="4" w:space="0" w:color="000000"/>
+              <w:left w:val="single" w:sz="4" w:space="0" w:color="000000"/>
+              <w:bottom w:val="single" w:sz="4" w:space="0" w:color="000000"/>
+              <w:right w:val="single" w:sz="4" w:space="0" w:color="000000"/>
+            </w:tcBorders>
+            <w:tcMar>
+              <w:top w:w="0" w:type="dxa"/>
+              <w:left w:w="70" w:type="dxa"/>
+              <w:bottom w:w="0" w:type="dxa"/>
+              <w:right w:w="70" w:type="dxa"/>
+            </w:tcMar>
+            <w:vAlign w:val="center"/>
+            <w:hideMark/>
+          </w:tcPr>
+          <w:p>
+            <w:r>
+              <w:t>Michał Samosiuk, Maciej Poźniak, Fabian Sobolewski</w:t>
+            </w:r>
+            <w:r>
+              <w:t xml:space="preserve">, </w:t>
+            </w:r>
+            <w:r>
+              <w:t>Natalia Nawrocka</w:t>
+            </w:r>
+          </w:p>
+        </w:tc>
+        <w:tc>
+          <w:tcPr>
+            <w:tcW w:w="1559" w:type="dxa"/>
+            <w:tcBorders>
+              <w:top w:val="single" w:sz="4" w:space="0" w:color="000000"/>
+              <w:left w:val="single" w:sz="4" w:space="0" w:color="000000"/>
+              <w:bottom w:val="single" w:sz="4" w:space="0" w:color="000000"/>
+              <w:right w:val="single" w:sz="4" w:space="0" w:color="000000"/>
+            </w:tcBorders>
+            <w:tcMar>
+              <w:top w:w="0" w:type="dxa"/>
+              <w:left w:w="70" w:type="dxa"/>
+              <w:bottom w:w="0" w:type="dxa"/>
+              <w:right w:w="70" w:type="dxa"/>
+            </w:tcMar>
+            <w:vAlign w:val="center"/>
+            <w:hideMark/>
+          </w:tcPr>
+          <w:p>
+            <w:r>
+              <w:t>22.04.2026</w:t>
+            </w:r>
+          </w:p>
+        </w:tc>
+        <w:tc>
+          <w:tcPr>
+            <w:tcW w:w="1650" w:type="dxa"/>
+            <w:tcBorders>
+              <w:top w:val="single" w:sz="4" w:space="0" w:color="000000"/>
+              <w:left w:val="single" w:sz="4" w:space="0" w:color="000000"/>
+              <w:bottom w:val="single" w:sz="4" w:space="0" w:color="000000"/>
+              <w:right w:val="single" w:sz="4" w:space="0" w:color="000000"/>
+            </w:tcBorders>
+            <w:tcMar>
+              <w:top w:w="0" w:type="dxa"/>
+              <w:left w:w="70" w:type="dxa"/>
+              <w:bottom w:w="0" w:type="dxa"/>
+              <w:right w:w="70" w:type="dxa"/>
+            </w:tcMar>
+            <w:vAlign w:val="center"/>
+            <w:hideMark/>
+          </w:tcPr>
+          <w:p>
+            <w:r>
+              <w:t>6.05.2026</w:t>
+            </w:r>
+          </w:p>
+        </w:tc>
+      </w:tr>
+      <w:tr>
+        <w:trPr>
+          <w:trHeight w:val="300"/>
+        </w:trPr>
+        <w:tc>
+          <w:tcPr>
+            <w:tcW w:w="0" w:type="auto"/>
+            <w:tcBorders>
+              <w:top w:val="single" w:sz="4" w:space="0" w:color="000000"/>
+              <w:left w:val="single" w:sz="4" w:space="0" w:color="000000"/>
+              <w:bottom w:val="single" w:sz="4" w:space="0" w:color="000000"/>
+              <w:right w:val="single" w:sz="4" w:space="0" w:color="000000"/>
+            </w:tcBorders>
+            <w:tcMar>
+              <w:top w:w="0" w:type="dxa"/>
+              <w:left w:w="70" w:type="dxa"/>
+              <w:bottom w:w="0" w:type="dxa"/>
+              <w:right w:w="70" w:type="dxa"/>
+            </w:tcMar>
+            <w:vAlign w:val="bottom"/>
+            <w:hideMark/>
+          </w:tcPr>
+          <w:p>
+            <w:pPr>
+              <w:jc w:val="center"/>
+            </w:pPr>
+            <w:r>
+              <w:t>5</w:t>
+            </w:r>
+          </w:p>
+        </w:tc>
+        <w:tc>
+          <w:tcPr>
+            <w:tcW w:w="1730" w:type="dxa"/>
+            <w:gridSpan w:val="2"/>
+            <w:tcBorders>
+              <w:top w:val="single" w:sz="4" w:space="0" w:color="000000"/>
+              <w:left w:val="single" w:sz="4" w:space="0" w:color="000000"/>
+              <w:bottom w:val="single" w:sz="4" w:space="0" w:color="000000"/>
+              <w:right w:val="single" w:sz="4" w:space="0" w:color="000000"/>
+            </w:tcBorders>
+            <w:tcMar>
+              <w:top w:w="0" w:type="dxa"/>
+              <w:left w:w="70" w:type="dxa"/>
+              <w:bottom w:w="0" w:type="dxa"/>
+              <w:right w:w="70" w:type="dxa"/>
+            </w:tcMar>
+            <w:vAlign w:val="center"/>
+            <w:hideMark/>
+          </w:tcPr>
+          <w:p>
+            <w:r>
+              <w:t>Wstępne zakończenie Projektu</w:t>
+            </w:r>
+          </w:p>
+        </w:tc>
+        <w:tc>
+          <w:tcPr>
+            <w:tcW w:w="2835" w:type="dxa"/>
+            <w:tcBorders>
+              <w:top w:val="single" w:sz="4" w:space="0" w:color="000000"/>
+              <w:left w:val="single" w:sz="4" w:space="0" w:color="000000"/>
+              <w:bottom w:val="single" w:sz="4" w:space="0" w:color="000000"/>
+              <w:right w:val="single" w:sz="4" w:space="0" w:color="000000"/>
+            </w:tcBorders>
+            <w:tcMar>
+              <w:top w:w="0" w:type="dxa"/>
+              <w:left w:w="70" w:type="dxa"/>
+              <w:bottom w:w="0" w:type="dxa"/>
+              <w:right w:w="70" w:type="dxa"/>
+            </w:tcMar>
+            <w:vAlign w:val="center"/>
+            <w:hideMark/>
+          </w:tcPr>
+          <w:p>
+            <w:r>
+              <w:t>Michał Samosiuk, Maciej Poźniak, Fabian Sobolewski</w:t>
+            </w:r>
+            <w:r>
+              <w:t xml:space="preserve">, </w:t>
+            </w:r>
+            <w:r>
+              <w:t>Natalia Nawrocka</w:t>
+            </w:r>
+          </w:p>
+        </w:tc>
+        <w:tc>
+          <w:tcPr>
+            <w:tcW w:w="1559" w:type="dxa"/>
+            <w:tcBorders>
+              <w:top w:val="single" w:sz="4" w:space="0" w:color="000000"/>
+              <w:left w:val="single" w:sz="4" w:space="0" w:color="000000"/>
+              <w:bottom w:val="single" w:sz="4" w:space="0" w:color="000000"/>
+              <w:right w:val="single" w:sz="4" w:space="0" w:color="000000"/>
+            </w:tcBorders>
+            <w:tcMar>
+              <w:top w:w="0" w:type="dxa"/>
+              <w:left w:w="70" w:type="dxa"/>
+              <w:bottom w:w="0" w:type="dxa"/>
+              <w:right w:w="70" w:type="dxa"/>
+            </w:tcMar>
+            <w:vAlign w:val="bottom"/>
+            <w:hideMark/>
+          </w:tcPr>
+          <w:p>
+            <w:r>
+              <w:t>6.05.2026</w:t>
+            </w:r>
+          </w:p>
+        </w:tc>
+        <w:tc>
+          <w:tcPr>
+            <w:tcW w:w="1650" w:type="dxa"/>
+            <w:tcBorders>
+              <w:top w:val="single" w:sz="4" w:space="0" w:color="000000"/>
+              <w:left w:val="single" w:sz="4" w:space="0" w:color="000000"/>
+              <w:bottom w:val="single" w:sz="4" w:space="0" w:color="000000"/>
+              <w:right w:val="single" w:sz="4" w:space="0" w:color="000000"/>
+            </w:tcBorders>
+            <w:tcMar>
+              <w:top w:w="0" w:type="dxa"/>
+              <w:left w:w="70" w:type="dxa"/>
+              <w:bottom w:w="0" w:type="dxa"/>
+              <w:right w:w="70" w:type="dxa"/>
+            </w:tcMar>
+            <w:vAlign w:val="bottom"/>
+            <w:hideMark/>
+          </w:tcPr>
+          <w:p>
+            <w:r>
+              <w:t>15.05.2026</w:t>
+            </w:r>
+          </w:p>
+        </w:tc>
+      </w:tr>
+      <w:tr>
+        <w:trPr>
+          <w:trHeight w:val="300"/>
+        </w:trPr>
+        <w:tc>
+          <w:tcPr>
+            <w:tcW w:w="0" w:type="auto"/>
+            <w:tcBorders>
+              <w:top w:val="single" w:sz="4" w:space="0" w:color="000000"/>
+              <w:left w:val="single" w:sz="4" w:space="0" w:color="000000"/>
+              <w:bottom w:val="single" w:sz="4" w:space="0" w:color="000000"/>
+              <w:right w:val="single" w:sz="4" w:space="0" w:color="000000"/>
+            </w:tcBorders>
+            <w:tcMar>
+              <w:top w:w="0" w:type="dxa"/>
+              <w:left w:w="70" w:type="dxa"/>
+              <w:bottom w:w="0" w:type="dxa"/>
+              <w:right w:w="70" w:type="dxa"/>
+            </w:tcMar>
+            <w:vAlign w:val="bottom"/>
+            <w:hideMark/>
+          </w:tcPr>
+          <w:p>
+            <w:pPr>
+              <w:jc w:val="center"/>
+            </w:pPr>
+            <w:r>
+              <w:t>6</w:t>
+            </w:r>
+          </w:p>
+        </w:tc>
+        <w:tc>
+          <w:tcPr>
+            <w:tcW w:w="1730" w:type="dxa"/>
+            <w:gridSpan w:val="2"/>
+            <w:tcBorders>
+              <w:top w:val="single" w:sz="4" w:space="0" w:color="000000"/>
+              <w:left w:val="single" w:sz="4" w:space="0" w:color="000000"/>
+              <w:bottom w:val="single" w:sz="4" w:space="0" w:color="000000"/>
+              <w:right w:val="single" w:sz="4" w:space="0" w:color="000000"/>
+            </w:tcBorders>
+            <w:tcMar>
+              <w:top w:w="0" w:type="dxa"/>
+              <w:left w:w="70" w:type="dxa"/>
+              <w:bottom w:w="0" w:type="dxa"/>
+              <w:right w:w="70" w:type="dxa"/>
+            </w:tcMar>
+            <w:vAlign w:val="bottom"/>
+            <w:hideMark/>
+          </w:tcPr>
+          <w:p>
+            <w:r>
+              <w:t>Testowanie Projektu i wprowadzenie Poprawek</w:t>
+            </w:r>
+          </w:p>
+        </w:tc>
+        <w:tc>
+          <w:tcPr>
+            <w:tcW w:w="2835" w:type="dxa"/>
+            <w:tcBorders>
+              <w:top w:val="single" w:sz="4" w:space="0" w:color="000000"/>
+              <w:left w:val="single" w:sz="4" w:space="0" w:color="000000"/>
+              <w:bottom w:val="single" w:sz="4" w:space="0" w:color="000000"/>
+              <w:right w:val="single" w:sz="4" w:space="0" w:color="000000"/>
+            </w:tcBorders>
+            <w:tcMar>
+              <w:top w:w="0" w:type="dxa"/>
+              <w:left w:w="70" w:type="dxa"/>
+              <w:bottom w:w="0" w:type="dxa"/>
+              <w:right w:w="70" w:type="dxa"/>
+            </w:tcMar>
+            <w:vAlign w:val="bottom"/>
+            <w:hideMark/>
+          </w:tcPr>
+          <w:p>
+            <w:r>
+              <w:t>Michał Samosiuk, Maciej Poźniak, Fabian Sobolewski</w:t>
+            </w:r>
+            <w:r>
+              <w:t xml:space="preserve">, </w:t>
+            </w:r>
+            <w:r>
+              <w:t>Natalia Nawrocka</w:t>
+            </w:r>
+          </w:p>
+        </w:tc>
+        <w:tc>
+          <w:tcPr>
+            <w:tcW w:w="1559" w:type="dxa"/>
+            <w:tcBorders>
+              <w:top w:val="single" w:sz="4" w:space="0" w:color="000000"/>
+              <w:left w:val="single" w:sz="4" w:space="0" w:color="000000"/>
+              <w:bottom w:val="single" w:sz="4" w:space="0" w:color="000000"/>
+              <w:right w:val="single" w:sz="4" w:space="0" w:color="000000"/>
+            </w:tcBorders>
+            <w:tcMar>
+              <w:top w:w="0" w:type="dxa"/>
+              <w:left w:w="70" w:type="dxa"/>
+              <w:bottom w:w="0" w:type="dxa"/>
+              <w:right w:w="70" w:type="dxa"/>
+            </w:tcMar>
+            <w:vAlign w:val="bottom"/>
+            <w:hideMark/>
+          </w:tcPr>
+          <w:p>
+            <w:r>
+              <w:t>6.05.2026</w:t>
+            </w:r>
+          </w:p>
+        </w:tc>
+        <w:tc>
+          <w:tcPr>
+            <w:tcW w:w="1650" w:type="dxa"/>
+            <w:tcBorders>
+              <w:top w:val="single" w:sz="4" w:space="0" w:color="000000"/>
+              <w:left w:val="single" w:sz="4" w:space="0" w:color="000000"/>
+              <w:bottom w:val="single" w:sz="4" w:space="0" w:color="000000"/>
+              <w:right w:val="single" w:sz="4" w:space="0" w:color="000000"/>
+            </w:tcBorders>
+            <w:tcMar>
+              <w:top w:w="0" w:type="dxa"/>
+              <w:left w:w="70" w:type="dxa"/>
+              <w:bottom w:w="0" w:type="dxa"/>
+              <w:right w:w="70" w:type="dxa"/>
+            </w:tcMar>
+            <w:vAlign w:val="bottom"/>
+            <w:hideMark/>
+          </w:tcPr>
+          <w:p>
+            <w:r>
+              <w:t>15.05.2026</w:t>
+            </w:r>
+          </w:p>
+        </w:tc>
+      </w:tr>
+      <w:tr>
+        <w:trPr>
+          <w:trHeight w:val="300"/>
+        </w:trPr>
+        <w:tc>
+          <w:tcPr>
+            <w:tcW w:w="0" w:type="auto"/>
+            <w:tcBorders>
+              <w:top w:val="single" w:sz="4" w:space="0" w:color="000000"/>
+              <w:left w:val="single" w:sz="4" w:space="0" w:color="000000"/>
+              <w:bottom w:val="single" w:sz="4" w:space="0" w:color="000000"/>
+              <w:right w:val="single" w:sz="4" w:space="0" w:color="000000"/>
+            </w:tcBorders>
+            <w:tcMar>
+              <w:top w:w="0" w:type="dxa"/>
+              <w:left w:w="70" w:type="dxa"/>
+              <w:bottom w:w="0" w:type="dxa"/>
+              <w:right w:w="70" w:type="dxa"/>
+            </w:tcMar>
+            <w:vAlign w:val="bottom"/>
+            <w:hideMark/>
+          </w:tcPr>
+          <w:p>
+            <w:pPr>
+              <w:jc w:val="center"/>
+            </w:pPr>
+            <w:r>
+              <w:t>7</w:t>
+            </w:r>
+          </w:p>
+        </w:tc>
+        <w:tc>
+          <w:tcPr>
+            <w:tcW w:w="1730" w:type="dxa"/>
+            <w:gridSpan w:val="2"/>
+            <w:tcBorders>
+              <w:top w:val="single" w:sz="4" w:space="0" w:color="000000"/>
+              <w:left w:val="single" w:sz="4" w:space="0" w:color="000000"/>
+              <w:bottom w:val="single" w:sz="4" w:space="0" w:color="000000"/>
+              <w:right w:val="single" w:sz="4" w:space="0" w:color="000000"/>
+            </w:tcBorders>
+            <w:tcMar>
+              <w:top w:w="0" w:type="dxa"/>
+              <w:left w:w="70" w:type="dxa"/>
+              <w:bottom w:w="0" w:type="dxa"/>
+              <w:right w:w="70" w:type="dxa"/>
+            </w:tcMar>
+            <w:vAlign w:val="bottom"/>
+            <w:hideMark/>
+          </w:tcPr>
+          <w:p>
+            <w:r>
+              <w:t>Dokumentacja</w:t>
+            </w:r>
+          </w:p>
+        </w:tc>
+        <w:tc>
+          <w:tcPr>
+            <w:tcW w:w="2835" w:type="dxa"/>
+            <w:tcBorders>
+              <w:top w:val="single" w:sz="4" w:space="0" w:color="000000"/>
+              <w:left w:val="single" w:sz="4" w:space="0" w:color="000000"/>
+              <w:bottom w:val="single" w:sz="4" w:space="0" w:color="000000"/>
+              <w:right w:val="single" w:sz="4" w:space="0" w:color="000000"/>
+            </w:tcBorders>
+            <w:tcMar>
+              <w:top w:w="0" w:type="dxa"/>
+              <w:left w:w="70" w:type="dxa"/>
+              <w:bottom w:w="0" w:type="dxa"/>
+              <w:right w:w="70" w:type="dxa"/>
+            </w:tcMar>
+            <w:vAlign w:val="bottom"/>
+            <w:hideMark/>
+          </w:tcPr>
+          <w:p>
+            <w:r>
+              <w:t>Maciej Poźniak, Fabian Sobolewski</w:t>
+            </w:r>
+          </w:p>
+        </w:tc>
+        <w:tc>
+          <w:tcPr>
+            <w:tcW w:w="1559" w:type="dxa"/>
+            <w:tcBorders>
+              <w:top w:val="single" w:sz="4" w:space="0" w:color="000000"/>
+              <w:left w:val="single" w:sz="4" w:space="0" w:color="000000"/>
+              <w:bottom w:val="single" w:sz="4" w:space="0" w:color="000000"/>
+              <w:right w:val="single" w:sz="4" w:space="0" w:color="000000"/>
+            </w:tcBorders>
+            <w:tcMar>
+              <w:top w:w="0" w:type="dxa"/>
+              <w:left w:w="70" w:type="dxa"/>
+              <w:bottom w:w="0" w:type="dxa"/>
+              <w:right w:w="70" w:type="dxa"/>
+            </w:tcMar>
+            <w:vAlign w:val="bottom"/>
+            <w:hideMark/>
+          </w:tcPr>
+          <w:p>
+            <w:r>
+              <w:t>15.05.2026</w:t>
+            </w:r>
+          </w:p>
+        </w:tc>
+        <w:tc>
+          <w:tcPr>
+            <w:tcW w:w="1650" w:type="dxa"/>
+            <w:tcBorders>
+              <w:top w:val="single" w:sz="4" w:space="0" w:color="000000"/>
+              <w:left w:val="single" w:sz="4" w:space="0" w:color="000000"/>
+              <w:bottom w:val="single" w:sz="4" w:space="0" w:color="000000"/>
+              <w:right w:val="single" w:sz="4" w:space="0" w:color="000000"/>
+            </w:tcBorders>
+            <w:tcMar>
+              <w:top w:w="0" w:type="dxa"/>
+              <w:left w:w="70" w:type="dxa"/>
+              <w:bottom w:w="0" w:type="dxa"/>
+              <w:right w:w="70" w:type="dxa"/>
+            </w:tcMar>
+            <w:vAlign w:val="bottom"/>
+            <w:hideMark/>
+          </w:tcPr>
+          <w:p>
+            <w:r>
+              <w:t>19.05.2026</w:t>
+            </w:r>
+          </w:p>
+        </w:tc>
+      </w:tr>
+    </w:tbl>
     <w:p/>
     <w:sectPr>
       <w:pgSz w:w="11906" w:h="16838"/>
@@ -10638,7 +12041,6 @@
   <w:style w:type="character" w:default="1" w:styleId="Domylnaczcionkaakapitu">
     <w:name w:val="Default Paragraph Font"/>
     <w:uiPriority w:val="1"/>
-    <w:semiHidden/>
     <w:unhideWhenUsed/>
   </w:style>
   <w:style w:type="table" w:default="1" w:styleId="Standardowy">

</xml_diff>